<commit_message>
Expand TR bibliography 25->39 refs, update companion docs, rebuild zip
</commit_message>
<xml_diff>
--- a/download/Submission_Checklist_IEEE_TR.docx
+++ b/download/Submission_Checklist_IEEE_TR.docx
@@ -262,7 +262,7 @@
                 <w:sz w:val="21"/>
                 <w:szCs w:val="21"/>
               </w:rPr>
-              <w:t xml:space="preserve">Main manuscript, 11 double-column pages (IEEEtran journal class), compiled from main_tr.tex.</w:t>
+              <w:t xml:space="preserve">Main manuscript, 12 double-column pages (IEEEtran journal class), compiled from main_tr.tex.</w:t>
             </w:r>
           </w:p>
         </w:tc>
@@ -1397,7 +1397,7 @@
                 <w:sz w:val="21"/>
                 <w:szCs w:val="21"/>
               </w:rPr>
-              <w:t xml:space="preserve">11 pages main text plus a 3-page supplement. Verify the current regular-paper page limit and over-length policy on the IEEE TR Author Center before uploading.</w:t>
+              <w:t xml:space="preserve">12 pages main text plus a 3-page supplement (15 total), within the ~15-page regular-paper limit. Verify the current limit and over-length policy on the IEEE TR Author Center before uploading.</w:t>
             </w:r>
           </w:p>
         </w:tc>
@@ -1757,7 +1757,7 @@
                 <w:sz w:val="21"/>
                 <w:szCs w:val="21"/>
               </w:rPr>
-              <w:t xml:space="preserve">25 entries in IEEE style; all 25 verified against publisher records (Crossref, arXiv, PMLR, publisher pages) on October 30, 2026.</w:t>
+              <w:t xml:space="preserve">39 entries in IEEE style, ordered by first citation: the original 25 verified against publisher records, plus 14 added citations (battery PHM/BMS reviews, dataset shift, shortcut learning, and the methodological sources for the GRU, hazard model, bootstrap, AUC, Brier score, ECE, PR-AUC, and TinyML), all verified on October 30, 2026.</w:t>
             </w:r>
           </w:p>
         </w:tc>
@@ -2203,7 +2203,7 @@
           <w:sz w:val="24"/>
           <w:szCs w:val="24"/>
         </w:rPr>
-        <w:t xml:space="preserve">1. Companion-study reference [14]:  </w:t>
+        <w:t xml:space="preserve">1. Companion-study reference [18]:  </w:t>
       </w:r>
       <w:r>
         <w:rPr>
@@ -2461,7 +2461,7 @@
           <w:sz w:val="24"/>
           <w:szCs w:val="24"/>
         </w:rPr>
-        <w:t xml:space="preserve">25 cite keys matched to 25 bibliography entries; no undefined citations, orphans, or duplicates. On October 30, 2026, every entry was verified against publisher records: five reconstructed entries were corrected to their published details, one unverifiable entry (a JMLR attribution) was replaced with the verifiable ICML 2023 paper by the same authors, and one citation-context mismatch was fixed (the Huang et al. finding on imbalanced-data calibration is now stated accurately).</w:t>
+        <w:t xml:space="preserve">39 cite keys matched to 39 bibliography entries, in order of first citation; no undefined citations, orphans, or duplicates. On October 30, 2026, every entry was verified against publisher records: five reconstructed entries were corrected to their published details, one unverifiable entry (a JMLR attribution) was replaced with the verifiable ICML 2023 paper by the same authors, one citation-context mismatch was fixed (the Huang et al. finding on imbalanced-data calibration is now stated accurately), and 14 standard citations were added to widen coverage of the battery-PHM, dataset-shift, and methodology literature, each verified against Crossref, the publisher page, PMLR, the ACL Anthology, or arXiv.</w:t>
       </w:r>
     </w:p>
     <w:p>
@@ -2492,7 +2492,7 @@
           <w:sz w:val="24"/>
           <w:szCs w:val="24"/>
         </w:rPr>
-        <w:t xml:space="preserve">section cross-references verified against the compiled headings; author biographies deduplicated; placeholder audit clean; layout inspected on all 14 pages. The package was recompiled and re-inspected after the author-block and bibliography updates of October 30, 2026.</w:t>
+        <w:t xml:space="preserve">section cross-references verified against the compiled headings; author biographies deduplicated; placeholder audit clean; layout inspected on all 15 pages. The package was recompiled and re-inspected after the author-block, bibliography-expansion, and reference-verification updates of October 30, 2026.</w:t>
       </w:r>
     </w:p>
     <w:p>

</xml_diff>